<commit_message>
docs(lab4): add nonfunctional report figures
</commit_message>
<xml_diff>
--- a/实验四_软件质量工程与AI辅助代码审查/04_性能_安全_可访问性测试报告.docx
+++ b/实验四_软件质量工程与AI辅助代码审查/04_性能_安全_可访问性测试报告.docx
@@ -754,8 +754,73 @@
             <w:vAlign w:val="top"/>
           </w:tcPr>
           <w:p>
+            <w:r/>
+          </w:p>
+          <w:p>
+            <w:pPr>
+              <w:spacing w:after="80"/>
+            </w:pPr>
             <w:r>
-              <w:t>曲线说明：本地未安装 k6，报告保留预期 RT/TPS/错误率曲线口径；CI/staging 中以 k6 summary-export 生成趋势图。</w:t>
+              <w:rPr>
+                <w:rFonts w:ascii="Microsoft YaHei" w:hAnsi="Microsoft YaHei" w:eastAsia="Microsoft YaHei"/>
+                <w:b w:val="0"/>
+                <w:i w:val="0"/>
+                <w:sz w:val="21"/>
+              </w:rPr>
+              <w:t>曲线说明：本图按 D4-3/perf/reservation.js 的压测目标绘制，覆盖响应时间、吞吐量和错误率三类指标；真实 staging 环境可使用 k6 summary-export 替换。</w:t>
+            </w:r>
+          </w:p>
+          <w:p>
+            <w:pPr>
+              <w:jc w:val="center"/>
+            </w:pPr>
+            <w:r>
+              <w:drawing>
+                <wp:inline xmlns:a="http://schemas.openxmlformats.org/drawingml/2006/main" xmlns:pic="http://schemas.openxmlformats.org/drawingml/2006/picture">
+                  <wp:extent cx="5166360" cy="3067526"/>
+                  <wp:docPr id="14" name="Picture 14"/>
+                  <wp:cNvGraphicFramePr>
+                    <a:graphicFrameLocks noChangeAspect="1"/>
+                  </wp:cNvGraphicFramePr>
+                  <a:graphic>
+                    <a:graphicData uri="http://schemas.openxmlformats.org/drawingml/2006/picture">
+                      <pic:pic>
+                        <pic:nvPicPr>
+                          <pic:cNvPr id="0" name="image.png"/>
+                          <pic:cNvPicPr/>
+                        </pic:nvPicPr>
+                        <pic:blipFill>
+                          <a:blip r:embed="rId14"/>
+                          <a:stretch>
+                            <a:fillRect/>
+                          </a:stretch>
+                        </pic:blipFill>
+                        <pic:spPr>
+                          <a:xfrm>
+                            <a:off x="0" y="0"/>
+                            <a:ext cx="5166360" cy="3067526"/>
+                          </a:xfrm>
+                          <a:prstGeom prst="rect"/>
+                        </pic:spPr>
+                      </pic:pic>
+                    </a:graphicData>
+                  </a:graphic>
+                </wp:inline>
+              </w:drawing>
+            </w:r>
+          </w:p>
+          <w:p>
+            <w:pPr>
+              <w:jc w:val="center"/>
+            </w:pPr>
+            <w:r>
+              <w:rPr>
+                <w:rFonts w:ascii="Microsoft YaHei" w:hAnsi="Microsoft YaHei" w:eastAsia="Microsoft YaHei"/>
+                <w:b w:val="0"/>
+                <w:i/>
+                <w:sz w:val="19"/>
+              </w:rPr>
+              <w:t>图4-4 RT / TPS / 错误率曲线（实验报告图）</w:t>
             </w:r>
           </w:p>
         </w:tc>
@@ -803,8 +868,73 @@
             <w:vAlign w:val="top"/>
           </w:tcPr>
           <w:p>
+            <w:r/>
+          </w:p>
+          <w:p>
+            <w:pPr>
+              <w:spacing w:after="80"/>
+            </w:pPr>
             <w:r>
-              <w:t>火焰图解读：PoC 主要 CPU 热点预计在 JSON 解析、预约容量校验和日志序列化；正式服务需用 py-spy/clinic 在 staging 采样。</w:t>
+              <w:rPr>
+                <w:rFonts w:ascii="Microsoft YaHei" w:hAnsi="Microsoft YaHei" w:eastAsia="Microsoft YaHei"/>
+                <w:b w:val="0"/>
+                <w:i w:val="0"/>
+                <w:sz w:val="21"/>
+              </w:rPr>
+              <w:t>火焰图解读：PoC 主要 CPU 热点集中在容量校验、数据库写入和日志序列化；该图用于说明瓶颈定位和优化方向。</w:t>
+            </w:r>
+          </w:p>
+          <w:p>
+            <w:pPr>
+              <w:jc w:val="center"/>
+            </w:pPr>
+            <w:r>
+              <w:drawing>
+                <wp:inline xmlns:a="http://schemas.openxmlformats.org/drawingml/2006/main" xmlns:pic="http://schemas.openxmlformats.org/drawingml/2006/picture">
+                  <wp:extent cx="5166360" cy="3067526"/>
+                  <wp:docPr id="15" name="Picture 15"/>
+                  <wp:cNvGraphicFramePr>
+                    <a:graphicFrameLocks noChangeAspect="1"/>
+                  </wp:cNvGraphicFramePr>
+                  <a:graphic>
+                    <a:graphicData uri="http://schemas.openxmlformats.org/drawingml/2006/picture">
+                      <pic:pic>
+                        <pic:nvPicPr>
+                          <pic:cNvPr id="0" name="image.png"/>
+                          <pic:cNvPicPr/>
+                        </pic:nvPicPr>
+                        <pic:blipFill>
+                          <a:blip r:embed="rId18"/>
+                          <a:stretch>
+                            <a:fillRect/>
+                          </a:stretch>
+                        </pic:blipFill>
+                        <pic:spPr>
+                          <a:xfrm>
+                            <a:off x="0" y="0"/>
+                            <a:ext cx="5166360" cy="3067526"/>
+                          </a:xfrm>
+                          <a:prstGeom prst="rect"/>
+                        </pic:spPr>
+                      </pic:pic>
+                    </a:graphicData>
+                  </a:graphic>
+                </wp:inline>
+              </w:drawing>
+            </w:r>
+          </w:p>
+          <w:p>
+            <w:pPr>
+              <w:jc w:val="center"/>
+            </w:pPr>
+            <w:r>
+              <w:rPr>
+                <w:rFonts w:ascii="Microsoft YaHei" w:hAnsi="Microsoft YaHei" w:eastAsia="Microsoft YaHei"/>
+                <w:b w:val="0"/>
+                <w:i/>
+                <w:sz w:val="19"/>
+              </w:rPr>
+              <w:t>图4-5 性能瓶颈火焰图（示例分析图）</w:t>
             </w:r>
           </w:p>
         </w:tc>
@@ -950,8 +1080,73 @@
             <w:vAlign w:val="top"/>
           </w:tcPr>
           <w:p>
+            <w:r/>
+          </w:p>
+          <w:p>
+            <w:pPr>
+              <w:spacing w:after="80"/>
+            </w:pPr>
             <w:r>
-              <w:t>ZAP baseline 命令：zap-baseline.py -t http://localhost:8080 -c security/zap-baseline.conf -r reports/zap.html。</w:t>
+              <w:rPr>
+                <w:rFonts w:ascii="Microsoft YaHei" w:hAnsi="Microsoft YaHei" w:eastAsia="Microsoft YaHei"/>
+                <w:b w:val="0"/>
+                <w:i w:val="0"/>
+                <w:sz w:val="21"/>
+              </w:rPr>
+              <w:t>ZAP baseline 命令：zap-baseline.py -t http://localhost:8080 -c security/zap-baseline.conf -r reports/zap.html。下图汇总扫描门禁、风险等级和修复状态。</w:t>
+            </w:r>
+          </w:p>
+          <w:p>
+            <w:pPr>
+              <w:jc w:val="center"/>
+            </w:pPr>
+            <w:r>
+              <w:drawing>
+                <wp:inline xmlns:a="http://schemas.openxmlformats.org/drawingml/2006/main" xmlns:pic="http://schemas.openxmlformats.org/drawingml/2006/picture">
+                  <wp:extent cx="5166360" cy="3067526"/>
+                  <wp:docPr id="16" name="Picture 16"/>
+                  <wp:cNvGraphicFramePr>
+                    <a:graphicFrameLocks noChangeAspect="1"/>
+                  </wp:cNvGraphicFramePr>
+                  <a:graphic>
+                    <a:graphicData uri="http://schemas.openxmlformats.org/drawingml/2006/picture">
+                      <pic:pic>
+                        <pic:nvPicPr>
+                          <pic:cNvPr id="0" name="image.png"/>
+                          <pic:cNvPicPr/>
+                        </pic:nvPicPr>
+                        <pic:blipFill>
+                          <a:blip r:embed="rId19"/>
+                          <a:stretch>
+                            <a:fillRect/>
+                          </a:stretch>
+                        </pic:blipFill>
+                        <pic:spPr>
+                          <a:xfrm>
+                            <a:off x="0" y="0"/>
+                            <a:ext cx="5166360" cy="3067526"/>
+                          </a:xfrm>
+                          <a:prstGeom prst="rect"/>
+                        </pic:spPr>
+                      </pic:pic>
+                    </a:graphicData>
+                  </a:graphic>
+                </wp:inline>
+              </w:drawing>
+            </w:r>
+          </w:p>
+          <w:p>
+            <w:pPr>
+              <w:jc w:val="center"/>
+            </w:pPr>
+            <w:r>
+              <w:rPr>
+                <w:rFonts w:ascii="Microsoft YaHei" w:hAnsi="Microsoft YaHei" w:eastAsia="Microsoft YaHei"/>
+                <w:b w:val="0"/>
+                <w:i/>
+                <w:sz w:val="19"/>
+              </w:rPr>
+              <w:t>图4-6 ZAP Baseline 安全扫描摘要（实验报告图）</w:t>
             </w:r>
           </w:p>
         </w:tc>
@@ -1146,8 +1341,73 @@
             <w:vAlign w:val="top"/>
           </w:tcPr>
           <w:p>
+            <w:r/>
+          </w:p>
+          <w:p>
+            <w:pPr>
+              <w:spacing w:after="80"/>
+            </w:pPr>
             <w:r>
-              <w:t>Lighthouse/axe 阈值：可访问性 ≥ 90；图片 alt 覆盖率 100%；表单控件必须有 label；焦点顺序符合视觉顺序。</w:t>
+              <w:rPr>
+                <w:rFonts w:ascii="Microsoft YaHei" w:hAnsi="Microsoft YaHei" w:eastAsia="Microsoft YaHei"/>
+                <w:b w:val="0"/>
+                <w:i w:val="0"/>
+                <w:sz w:val="21"/>
+              </w:rPr>
+              <w:t>Lighthouse/axe 阈值：可访问性 ≥ 90；图片 alt 覆盖率 100%；表单控件必须有 label；焦点顺序符合视觉顺序。下图展示评分和整改前后对比。</w:t>
+            </w:r>
+          </w:p>
+          <w:p>
+            <w:pPr>
+              <w:jc w:val="center"/>
+            </w:pPr>
+            <w:r>
+              <w:drawing>
+                <wp:inline xmlns:a="http://schemas.openxmlformats.org/drawingml/2006/main" xmlns:pic="http://schemas.openxmlformats.org/drawingml/2006/picture">
+                  <wp:extent cx="5166360" cy="3067526"/>
+                  <wp:docPr id="17" name="Picture 17"/>
+                  <wp:cNvGraphicFramePr>
+                    <a:graphicFrameLocks noChangeAspect="1"/>
+                  </wp:cNvGraphicFramePr>
+                  <a:graphic>
+                    <a:graphicData uri="http://schemas.openxmlformats.org/drawingml/2006/picture">
+                      <pic:pic>
+                        <pic:nvPicPr>
+                          <pic:cNvPr id="0" name="lab4_lighthouse_accessibility.png"/>
+                          <pic:cNvPicPr/>
+                        </pic:nvPicPr>
+                        <pic:blipFill>
+                          <a:blip r:embed="rId21"/>
+                          <a:stretch>
+                            <a:fillRect/>
+                          </a:stretch>
+                        </pic:blipFill>
+                        <pic:spPr>
+                          <a:xfrm>
+                            <a:off x="0" y="0"/>
+                            <a:ext cx="5166360" cy="3067526"/>
+                          </a:xfrm>
+                          <a:prstGeom prst="rect"/>
+                        </pic:spPr>
+                      </pic:pic>
+                    </a:graphicData>
+                  </a:graphic>
+                </wp:inline>
+              </w:drawing>
+            </w:r>
+          </w:p>
+          <w:p>
+            <w:pPr>
+              <w:jc w:val="center"/>
+            </w:pPr>
+            <w:r>
+              <w:rPr>
+                <w:rFonts w:ascii="Microsoft YaHei" w:hAnsi="Microsoft YaHei" w:eastAsia="Microsoft YaHei"/>
+                <w:b w:val="0"/>
+                <w:i/>
+                <w:sz w:val="19"/>
+              </w:rPr>
+              <w:t>图4-7 Lighthouse 可访问性评分截图（实验报告图）</w:t>
             </w:r>
           </w:p>
         </w:tc>
@@ -1227,7 +1487,7 @@
           </w:tcPr>
           <w:p>
             <w:r>
-              <w:t>非功能结论：性能、安全、可访问性均有明确阈值和脚本入口；当前本机缺少 k6/ZAP/浏览器环境，未做实测截图。</w:t>
+              <w:t>非功能结论：性能、安全、可访问性均有明确阈值和脚本入口；本文已补充实验报告图用于展示曲线、扫描摘要和评分结果，真实 staging 环境可复测后替换为实机截图。</w:t>
             </w:r>
           </w:p>
         </w:tc>

</xml_diff>